<commit_message>
Jobsheet 14: Bagian 1 – Install NextAuth
</commit_message>
<xml_diff>
--- a/Laporan/03_Ahmad Dzul Fadhli Jobsheet 12,13&14.docx
+++ b/Laporan/03_Ahmad Dzul Fadhli Jobsheet 12,13&14.docx
@@ -10930,6 +10930,167 @@
         </w:rPr>
         <w:t>.</w:t>
       </w:r>
+    </w:p>
+    <w:p>
+      <w:pPr>
+        <w:jc w:val="left"/>
+        <w:rPr>
+          <w:u w:val="single"/>
+          <w:lang w:val="en-ID"/>
+        </w:rPr>
+      </w:pPr>
+      <w:r>
+        <w:rPr>
+          <w:u w:val="single"/>
+          <w:lang w:val="en-ID"/>
+        </w:rPr>
+        <w:br w:type="page"/>
+      </w:r>
+    </w:p>
+    <w:p>
+      <w:pPr>
+        <w:pStyle w:val="Heading1"/>
+        <w:pBdr>
+          <w:bottom w:val="single" w:sz="6" w:space="1" w:color="auto"/>
+        </w:pBdr>
+      </w:pPr>
+      <w:r>
+        <w:lastRenderedPageBreak/>
+        <w:t xml:space="preserve">Laporan Jobsheet </w:t>
+      </w:r>
+      <w:r>
+        <w:t>1</w:t>
+      </w:r>
+      <w:r>
+        <w:t>4</w:t>
+      </w:r>
+      <w:r>
+        <w:t>:</w:t>
+      </w:r>
+      <w:r>
+        <w:t xml:space="preserve"> </w:t>
+      </w:r>
+      <w:r>
+        <w:t>Sistem Autentikasi</w:t>
+      </w:r>
+      <w:r>
+        <w:t xml:space="preserve"> - </w:t>
+      </w:r>
+      <w:r>
+        <w:t>Proteksi Route</w:t>
+      </w:r>
+      <w:r>
+        <w:t xml:space="preserve"> Matkul </w:t>
+      </w:r>
+      <w:r>
+        <w:t xml:space="preserve">Pemograman Berbasis Network </w:t>
+      </w:r>
+      <w:r>
+        <w:br/>
+      </w:r>
+      <w:r>
+        <w:t>Ahmad Dzul Fadhli Hannan | TI3F | 2341720106</w:t>
+      </w:r>
+    </w:p>
+    <w:p>
+      <w:pPr>
+        <w:pStyle w:val="Heading2"/>
+      </w:pPr>
+      <w:r>
+        <w:rPr>
+          <w:rFonts w:ascii="Segoe UI Symbol" w:hAnsi="Segoe UI Symbol" w:cs="Segoe UI Symbol"/>
+        </w:rPr>
+        <w:t>🛠</w:t>
+      </w:r>
+      <w:r>
+        <w:t xml:space="preserve"> C. Langkah Praktikum </w:t>
+      </w:r>
+    </w:p>
+    <w:p>
+      <w:pPr>
+        <w:rPr>
+          <w:u w:val="single"/>
+        </w:rPr>
+      </w:pPr>
+      <w:r>
+        <w:rPr>
+          <w:u w:val="single"/>
+        </w:rPr>
+        <w:t>Bagian 1 – Install NextAuth</w:t>
+      </w:r>
+    </w:p>
+    <w:p>
+      <w:pPr>
+        <w:rPr>
+          <w:u w:val="single"/>
+          <w:lang w:val="en-ID"/>
+        </w:rPr>
+      </w:pPr>
+      <w:r>
+        <w:rPr>
+          <w:u w:val="single"/>
+          <w:lang w:val="en-ID"/>
+        </w:rPr>
+        <w:drawing>
+          <wp:inline distT="0" distB="0" distL="0" distR="0" wp14:anchorId="24BBD42D" wp14:editId="28DC2B7C">
+            <wp:extent cx="2880000" cy="1394769"/>
+            <wp:effectExtent l="0" t="0" r="0" b="0"/>
+            <wp:docPr id="1346369484" name="Picture 1"/>
+            <wp:cNvGraphicFramePr>
+              <a:graphicFrameLocks xmlns:a="http://schemas.openxmlformats.org/drawingml/2006/main" noChangeAspect="1"/>
+            </wp:cNvGraphicFramePr>
+            <a:graphic xmlns:a="http://schemas.openxmlformats.org/drawingml/2006/main">
+              <a:graphicData uri="http://schemas.openxmlformats.org/drawingml/2006/picture">
+                <pic:pic xmlns:pic="http://schemas.openxmlformats.org/drawingml/2006/picture">
+                  <pic:nvPicPr>
+                    <pic:cNvPr id="1346369484" name=""/>
+                    <pic:cNvPicPr/>
+                  </pic:nvPicPr>
+                  <pic:blipFill>
+                    <a:blip r:embed="rId51"/>
+                    <a:stretch>
+                      <a:fillRect/>
+                    </a:stretch>
+                  </pic:blipFill>
+                  <pic:spPr>
+                    <a:xfrm>
+                      <a:off x="0" y="0"/>
+                      <a:ext cx="2880000" cy="1394769"/>
+                    </a:xfrm>
+                    <a:prstGeom prst="rect">
+                      <a:avLst/>
+                    </a:prstGeom>
+                  </pic:spPr>
+                </pic:pic>
+              </a:graphicData>
+            </a:graphic>
+          </wp:inline>
+        </w:drawing>
+      </w:r>
+    </w:p>
+    <w:p>
+      <w:pPr>
+        <w:rPr>
+          <w:u w:val="single"/>
+          <w:lang w:val="en-ID"/>
+        </w:rPr>
+      </w:pPr>
+    </w:p>
+    <w:p>
+      <w:pPr>
+        <w:rPr>
+          <w:u w:val="single"/>
+          <w:lang w:val="en-ID"/>
+        </w:rPr>
+      </w:pPr>
+    </w:p>
+    <w:p>
+      <w:pPr>
+        <w:rPr>
+          <w:u w:val="single"/>
+          <w:lang w:val="en-ID"/>
+        </w:rPr>
+      </w:pPr>
     </w:p>
     <w:sectPr>
       <w:pgSz w:w="12240" w:h="15840"/>

</xml_diff>

<commit_message>
Bagian 3 – Tambahkan Secret
</commit_message>
<xml_diff>
--- a/Laporan/03_Ahmad Dzul Fadhli Jobsheet 12,13&14.docx
+++ b/Laporan/03_Ahmad Dzul Fadhli Jobsheet 12,13&14.docx
@@ -11008,14 +11008,9 @@
     </w:p>
     <w:p>
       <w:pPr>
-        <w:rPr>
-          <w:u w:val="single"/>
-        </w:rPr>
-      </w:pPr>
-      <w:r>
-        <w:rPr>
-          <w:u w:val="single"/>
-        </w:rPr>
+        <w:pStyle w:val="Heading3"/>
+      </w:pPr>
+      <w:r>
         <w:t>Bagian 1 – Install NextAuth</w:t>
       </w:r>
     </w:p>
@@ -11070,12 +11065,342 @@
     </w:p>
     <w:p>
       <w:pPr>
-        <w:rPr>
-          <w:u w:val="single"/>
-          <w:lang w:val="en-ID"/>
-        </w:rPr>
-      </w:pPr>
-    </w:p>
+        <w:pStyle w:val="Heading3"/>
+      </w:pPr>
+      <w:r>
+        <w:t xml:space="preserve">Bagian 2 – </w:t>
+      </w:r>
+      <w:proofErr w:type="spellStart"/>
+      <w:r>
+        <w:t>Konfigurasi</w:t>
+      </w:r>
+      <w:proofErr w:type="spellEnd"/>
+      <w:r>
+        <w:t xml:space="preserve"> API Auth</w:t>
+      </w:r>
+    </w:p>
+    <w:p>
+      <w:proofErr w:type="spellStart"/>
+      <w:r>
+        <w:t>Buat</w:t>
+      </w:r>
+      <w:proofErr w:type="spellEnd"/>
+      <w:r>
+        <w:t xml:space="preserve"> file dan folder pada folder pages/</w:t>
+      </w:r>
+      <w:proofErr w:type="spellStart"/>
+      <w:r>
+        <w:t>api</w:t>
+      </w:r>
+      <w:proofErr w:type="spellEnd"/>
+      <w:r>
+        <w:t>/auth</w:t>
+      </w:r>
+      <w:proofErr w:type="gramStart"/>
+      <w:r>
+        <w:t>/[</w:t>
+      </w:r>
+      <w:proofErr w:type="gramEnd"/>
+      <w:r>
+        <w:t>...</w:t>
+      </w:r>
+      <w:proofErr w:type="spellStart"/>
+      <w:r>
+        <w:t>nextauth</w:t>
+      </w:r>
+      <w:proofErr w:type="spellEnd"/>
+      <w:r>
+        <w:t>].</w:t>
+      </w:r>
+      <w:proofErr w:type="spellStart"/>
+      <w:r>
+        <w:t>ts</w:t>
+      </w:r>
+      <w:proofErr w:type="spellEnd"/>
+    </w:p>
+    <w:p>
+      <w:proofErr w:type="spellStart"/>
+      <w:r>
+        <w:t>Modifikasi</w:t>
+      </w:r>
+      <w:proofErr w:type="spellEnd"/>
+      <w:r>
+        <w:t xml:space="preserve"> file […</w:t>
+      </w:r>
+      <w:proofErr w:type="spellStart"/>
+      <w:r>
+        <w:t>nextauth</w:t>
+      </w:r>
+      <w:proofErr w:type="spellEnd"/>
+      <w:r>
+        <w:t>].</w:t>
+      </w:r>
+      <w:proofErr w:type="spellStart"/>
+      <w:r>
+        <w:t>ts</w:t>
+      </w:r>
+      <w:proofErr w:type="spellEnd"/>
+      <w:r>
+        <w:t>:</w:t>
+      </w:r>
+    </w:p>
+    <w:p>
+      <w:r>
+        <w:lastRenderedPageBreak/>
+        <w:drawing>
+          <wp:inline distT="0" distB="0" distL="0" distR="0" wp14:anchorId="60B1C11A" wp14:editId="78A4758F">
+            <wp:extent cx="2880000" cy="4989947"/>
+            <wp:effectExtent l="0" t="0" r="0" b="1270"/>
+            <wp:docPr id="1279150384" name="Picture 1"/>
+            <wp:cNvGraphicFramePr>
+              <a:graphicFrameLocks xmlns:a="http://schemas.openxmlformats.org/drawingml/2006/main" noChangeAspect="1"/>
+            </wp:cNvGraphicFramePr>
+            <a:graphic xmlns:a="http://schemas.openxmlformats.org/drawingml/2006/main">
+              <a:graphicData uri="http://schemas.openxmlformats.org/drawingml/2006/picture">
+                <pic:pic xmlns:pic="http://schemas.openxmlformats.org/drawingml/2006/picture">
+                  <pic:nvPicPr>
+                    <pic:cNvPr id="1279150384" name=""/>
+                    <pic:cNvPicPr/>
+                  </pic:nvPicPr>
+                  <pic:blipFill>
+                    <a:blip r:embed="rId52"/>
+                    <a:stretch>
+                      <a:fillRect/>
+                    </a:stretch>
+                  </pic:blipFill>
+                  <pic:spPr>
+                    <a:xfrm>
+                      <a:off x="0" y="0"/>
+                      <a:ext cx="2880000" cy="4989947"/>
+                    </a:xfrm>
+                    <a:prstGeom prst="rect">
+                      <a:avLst/>
+                    </a:prstGeom>
+                  </pic:spPr>
+                </pic:pic>
+              </a:graphicData>
+            </a:graphic>
+          </wp:inline>
+        </w:drawing>
+      </w:r>
+    </w:p>
+    <w:p>
+      <w:pPr>
+        <w:pStyle w:val="Heading3"/>
+      </w:pPr>
+      <w:r>
+        <w:t xml:space="preserve">Bagian 3 – </w:t>
+      </w:r>
+      <w:proofErr w:type="spellStart"/>
+      <w:r>
+        <w:t>Tambahkan</w:t>
+      </w:r>
+      <w:proofErr w:type="spellEnd"/>
+      <w:r>
+        <w:t xml:space="preserve"> Secret</w:t>
+      </w:r>
+    </w:p>
+    <w:p>
+      <w:pPr>
+        <w:rPr>
+          <w:lang w:val="en-ID"/>
+        </w:rPr>
+      </w:pPr>
+      <w:r>
+        <w:rPr>
+          <w:lang w:val="en-ID"/>
+        </w:rPr>
+        <w:t>Buka file .</w:t>
+      </w:r>
+      <w:proofErr w:type="spellStart"/>
+      <w:proofErr w:type="gramStart"/>
+      <w:r>
+        <w:rPr>
+          <w:lang w:val="en-ID"/>
+        </w:rPr>
+        <w:t>env.local</w:t>
+      </w:r>
+      <w:proofErr w:type="spellEnd"/>
+      <w:proofErr w:type="gramEnd"/>
+      <w:r>
+        <w:rPr>
+          <w:lang w:val="en-ID"/>
+        </w:rPr>
+        <w:t xml:space="preserve"> dan </w:t>
+      </w:r>
+      <w:proofErr w:type="spellStart"/>
+      <w:r>
+        <w:rPr>
+          <w:lang w:val="en-ID"/>
+        </w:rPr>
+        <w:t>tambahkan</w:t>
+      </w:r>
+      <w:proofErr w:type="spellEnd"/>
+      <w:r>
+        <w:rPr>
+          <w:lang w:val="en-ID"/>
+        </w:rPr>
+        <w:t xml:space="preserve"> code pada line 12</w:t>
+      </w:r>
+    </w:p>
+    <w:p>
+      <w:pPr>
+        <w:rPr>
+          <w:lang w:val="en-ID"/>
+        </w:rPr>
+      </w:pPr>
+      <w:r>
+        <w:rPr>
+          <w:lang w:val="en-ID"/>
+        </w:rPr>
+        <w:t>o NEXTAUTH_SECRET=RANDOM_BASE64_STRING</w:t>
+      </w:r>
+    </w:p>
+    <w:p>
+      <w:pPr>
+        <w:rPr>
+          <w:lang w:val="en-ID"/>
+        </w:rPr>
+      </w:pPr>
+      <w:r>
+        <w:rPr>
+          <w:lang w:val="en-ID"/>
+        </w:rPr>
+        <w:t xml:space="preserve">o </w:t>
+      </w:r>
+      <w:proofErr w:type="spellStart"/>
+      <w:r>
+        <w:rPr>
+          <w:lang w:val="en-ID"/>
+        </w:rPr>
+        <w:t>Untuk</w:t>
+      </w:r>
+      <w:proofErr w:type="spellEnd"/>
+      <w:r>
+        <w:rPr>
+          <w:lang w:val="en-ID"/>
+        </w:rPr>
+        <w:t xml:space="preserve"> </w:t>
+      </w:r>
+      <w:proofErr w:type="spellStart"/>
+      <w:r>
+        <w:rPr>
+          <w:lang w:val="en-ID"/>
+        </w:rPr>
+        <w:t>mendapatkan</w:t>
+      </w:r>
+      <w:proofErr w:type="spellEnd"/>
+      <w:r>
+        <w:rPr>
+          <w:lang w:val="en-ID"/>
+        </w:rPr>
+        <w:t xml:space="preserve"> </w:t>
+      </w:r>
+      <w:proofErr w:type="spellStart"/>
+      <w:r>
+        <w:rPr>
+          <w:lang w:val="en-ID"/>
+        </w:rPr>
+        <w:t>nilai</w:t>
+      </w:r>
+      <w:proofErr w:type="spellEnd"/>
+      <w:r>
+        <w:rPr>
+          <w:lang w:val="en-ID"/>
+        </w:rPr>
+        <w:t xml:space="preserve"> RANDOM_BASE64_STRING </w:t>
+      </w:r>
+      <w:proofErr w:type="spellStart"/>
+      <w:r>
+        <w:rPr>
+          <w:lang w:val="en-ID"/>
+        </w:rPr>
+        <w:t>gunakan</w:t>
+      </w:r>
+      <w:proofErr w:type="spellEnd"/>
+      <w:r>
+        <w:rPr>
+          <w:lang w:val="en-ID"/>
+        </w:rPr>
+        <w:t xml:space="preserve"> generator</w:t>
+      </w:r>
+    </w:p>
+    <w:p>
+      <w:pPr>
+        <w:rPr>
+          <w:lang w:val="en-ID"/>
+        </w:rPr>
+      </w:pPr>
+      <w:r>
+        <w:rPr>
+          <w:lang w:val="en-ID"/>
+        </w:rPr>
+        <w:t xml:space="preserve">RANDOM_BASE64_STRING </w:t>
+      </w:r>
+      <w:proofErr w:type="spellStart"/>
+      <w:r>
+        <w:rPr>
+          <w:lang w:val="en-ID"/>
+        </w:rPr>
+        <w:t>seperti</w:t>
+      </w:r>
+      <w:proofErr w:type="spellEnd"/>
+      <w:r>
+        <w:rPr>
+          <w:lang w:val="en-ID"/>
+        </w:rPr>
+        <w:t xml:space="preserve"> </w:t>
+      </w:r>
+      <w:hyperlink r:id="rId53" w:history="1">
+        <w:r>
+          <w:rPr>
+            <w:rStyle w:val="Hyperlink"/>
+            <w:lang w:val="en-ID"/>
+          </w:rPr>
+          <w:t>https://www.convertsimple.com/randombase64-generator/</w:t>
+        </w:r>
+      </w:hyperlink>
+    </w:p>
+    <w:p>
+      <w:r>
+        <w:drawing>
+          <wp:inline distT="0" distB="0" distL="0" distR="0" wp14:anchorId="50920D77" wp14:editId="6528BAF3">
+            <wp:extent cx="2880000" cy="430769"/>
+            <wp:effectExtent l="0" t="0" r="0" b="7620"/>
+            <wp:docPr id="938654606" name="Picture 1"/>
+            <wp:cNvGraphicFramePr>
+              <a:graphicFrameLocks xmlns:a="http://schemas.openxmlformats.org/drawingml/2006/main" noChangeAspect="1"/>
+            </wp:cNvGraphicFramePr>
+            <a:graphic xmlns:a="http://schemas.openxmlformats.org/drawingml/2006/main">
+              <a:graphicData uri="http://schemas.openxmlformats.org/drawingml/2006/picture">
+                <pic:pic xmlns:pic="http://schemas.openxmlformats.org/drawingml/2006/picture">
+                  <pic:nvPicPr>
+                    <pic:cNvPr id="938654606" name=""/>
+                    <pic:cNvPicPr/>
+                  </pic:nvPicPr>
+                  <pic:blipFill>
+                    <a:blip r:embed="rId54"/>
+                    <a:stretch>
+                      <a:fillRect/>
+                    </a:stretch>
+                  </pic:blipFill>
+                  <pic:spPr>
+                    <a:xfrm>
+                      <a:off x="0" y="0"/>
+                      <a:ext cx="2880000" cy="430769"/>
+                    </a:xfrm>
+                    <a:prstGeom prst="rect">
+                      <a:avLst/>
+                    </a:prstGeom>
+                  </pic:spPr>
+                </pic:pic>
+              </a:graphicData>
+            </a:graphic>
+          </wp:inline>
+        </w:drawing>
+      </w:r>
+    </w:p>
+    <w:p/>
     <w:p>
       <w:pPr>
         <w:rPr>

</xml_diff>

<commit_message>
Bagian 4 – Tambahkan SessionProvider
</commit_message>
<xml_diff>
--- a/Laporan/03_Ahmad Dzul Fadhli Jobsheet 12,13&14.docx
+++ b/Laporan/03_Ahmad Dzul Fadhli Jobsheet 12,13&14.docx
@@ -11388,6 +11388,88 @@
                     <a:xfrm>
                       <a:off x="0" y="0"/>
                       <a:ext cx="2880000" cy="430769"/>
+                    </a:xfrm>
+                    <a:prstGeom prst="rect">
+                      <a:avLst/>
+                    </a:prstGeom>
+                  </pic:spPr>
+                </pic:pic>
+              </a:graphicData>
+            </a:graphic>
+          </wp:inline>
+        </w:drawing>
+      </w:r>
+    </w:p>
+    <w:p>
+      <w:pPr>
+        <w:pStyle w:val="Heading3"/>
+      </w:pPr>
+      <w:r>
+        <w:t xml:space="preserve">Bagian 4 – </w:t>
+      </w:r>
+      <w:proofErr w:type="spellStart"/>
+      <w:r>
+        <w:t>Tambahkan</w:t>
+      </w:r>
+      <w:proofErr w:type="spellEnd"/>
+      <w:r>
+        <w:t xml:space="preserve"> </w:t>
+      </w:r>
+      <w:proofErr w:type="spellStart"/>
+      <w:r>
+        <w:t>SessionProvider</w:t>
+      </w:r>
+      <w:proofErr w:type="spellEnd"/>
+    </w:p>
+    <w:p>
+      <w:r>
+        <w:t>Buka file _</w:t>
+      </w:r>
+      <w:proofErr w:type="spellStart"/>
+      <w:r>
+        <w:t>app.tsx</w:t>
+      </w:r>
+      <w:proofErr w:type="spellEnd"/>
+      <w:r>
+        <w:t xml:space="preserve"> dan </w:t>
+      </w:r>
+      <w:proofErr w:type="spellStart"/>
+      <w:r>
+        <w:t>modifikasi</w:t>
+      </w:r>
+      <w:proofErr w:type="spellEnd"/>
+      <w:r>
+        <w:t>:</w:t>
+      </w:r>
+    </w:p>
+    <w:p>
+      <w:r>
+        <w:lastRenderedPageBreak/>
+        <w:drawing>
+          <wp:inline distT="0" distB="0" distL="0" distR="0" wp14:anchorId="05BA5ED2" wp14:editId="77BE44C3">
+            <wp:extent cx="2880000" cy="1473538"/>
+            <wp:effectExtent l="0" t="0" r="0" b="0"/>
+            <wp:docPr id="1064081035" name="Picture 1"/>
+            <wp:cNvGraphicFramePr>
+              <a:graphicFrameLocks xmlns:a="http://schemas.openxmlformats.org/drawingml/2006/main" noChangeAspect="1"/>
+            </wp:cNvGraphicFramePr>
+            <a:graphic xmlns:a="http://schemas.openxmlformats.org/drawingml/2006/main">
+              <a:graphicData uri="http://schemas.openxmlformats.org/drawingml/2006/picture">
+                <pic:pic xmlns:pic="http://schemas.openxmlformats.org/drawingml/2006/picture">
+                  <pic:nvPicPr>
+                    <pic:cNvPr id="1064081035" name=""/>
+                    <pic:cNvPicPr/>
+                  </pic:nvPicPr>
+                  <pic:blipFill>
+                    <a:blip r:embed="rId55"/>
+                    <a:stretch>
+                      <a:fillRect/>
+                    </a:stretch>
+                  </pic:blipFill>
+                  <pic:spPr>
+                    <a:xfrm>
+                      <a:off x="0" y="0"/>
+                      <a:ext cx="2880000" cy="1473538"/>
                     </a:xfrm>
                     <a:prstGeom prst="rect">
                       <a:avLst/>

</xml_diff>